<commit_message>
Mise a jour description du projet
</commit_message>
<xml_diff>
--- a/Projet Python S2 Amélioration.docx
+++ b/Projet Python S2 Amélioration.docx
@@ -264,7 +264,7 @@
           </mc:Choice>
           <mc:Fallback>
             <w:pict>
-              <v:group w14:anchorId="5EE24581" id="Groupe 7" o:spid="_x0000_s1026" style="position:absolute;margin-left:0;margin-top:0;width:8in;height:95.7pt;z-index:251661312;mso-width-percent:941;mso-height-percent:121;mso-top-percent:23;mso-position-horizontal:center;mso-position-horizontal-relative:page;mso-position-vertical-relative:page;mso-width-percent:941;mso-height-percent:121;mso-top-percent:23" coordorigin="" coordsize="73152,12161" o:gfxdata="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">
+              <v:group w14:anchorId="1CF4741D" id="Groupe 7" o:spid="_x0000_s1026" style="position:absolute;margin-left:0;margin-top:0;width:8in;height:95.7pt;z-index:251661312;mso-width-percent:941;mso-height-percent:121;mso-top-percent:23;mso-position-horizontal:center;mso-position-horizontal-relative:page;mso-position-vertical-relative:page;mso-width-percent:941;mso-height-percent:121;mso-top-percent:23" coordorigin="" coordsize="73152,12161" o:gfxdata="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">
                 <v:shape id="Rectangle 51" o:spid="_x0000_s1027" style="position:absolute;width:73152;height:11303;visibility:visible;mso-wrap-style:square;v-text-anchor:middle" coordsize="7312660,1129665" o:gfxdata="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" path="m,l7312660,r,1129665l3619500,733425,,1091565,,xe" fillcolor="#156082 [3204]" stroked="f" strokeweight="1.5pt">
                   <v:stroke joinstyle="miter"/>
                   <v:path arrowok="t" o:connecttype="custom" o:connectlocs="0,0;7315200,0;7315200,1130373;3620757,733885;0,1092249;0,0" o:connectangles="0,0,0,0,0,0"/>
@@ -1168,6 +1168,33 @@
     <w:p>
       <w:pPr>
         <w:pStyle w:val="Paragraphedeliste"/>
+        <w:numPr>
+          <w:ilvl w:val="0"/>
+          <w:numId w:val="2"/>
+        </w:numPr>
+        <w:jc w:val="both"/>
+        <w:rPr>
+          <w:rFonts w:ascii="Times New Roman" w:hAnsi="Times New Roman" w:cs="Times New Roman"/>
+        </w:rPr>
+      </w:pPr>
+      <w:r>
+        <w:rPr>
+          <w:rFonts w:ascii="Times New Roman" w:hAnsi="Times New Roman" w:cs="Times New Roman"/>
+          <w:b/>
+          <w:bCs/>
+        </w:rPr>
+        <w:t>View.py</w:t>
+      </w:r>
+      <w:r>
+        <w:rPr>
+          <w:rFonts w:ascii="Times New Roman" w:hAnsi="Times New Roman" w:cs="Times New Roman"/>
+        </w:rPr>
+        <w:t xml:space="preserve"> : Ce fichier affiche un résumé des résultats dans la console à la fin du programme, c’est-à-dire le nombre de client, le total des prêts, et le top 5 des pays et secteurs les plus exposés. </w:t>
+      </w:r>
+    </w:p>
+    <w:p>
+      <w:pPr>
+        <w:pStyle w:val="Paragraphedeliste"/>
         <w:jc w:val="both"/>
         <w:rPr>
           <w:rFonts w:ascii="Times New Roman" w:hAnsi="Times New Roman" w:cs="Times New Roman"/>
@@ -1303,6 +1330,7 @@
           <w:sz w:val="28"/>
           <w:szCs w:val="28"/>
         </w:rPr>
+        <w:lastRenderedPageBreak/>
         <w:t>Logger</w:t>
       </w:r>
     </w:p>
@@ -1317,7 +1345,6 @@
         <w:rPr>
           <w:rFonts w:ascii="Times New Roman" w:hAnsi="Times New Roman" w:cs="Times New Roman"/>
         </w:rPr>
-        <w:lastRenderedPageBreak/>
         <w:t xml:space="preserve">Dans le code original, des instructions </w:t>
       </w:r>
       <w:proofErr w:type="spellStart"/>
@@ -1517,7 +1544,19 @@
         <w:rPr>
           <w:rFonts w:ascii="Times New Roman" w:hAnsi="Times New Roman" w:cs="Times New Roman"/>
         </w:rPr>
-        <w:t xml:space="preserve">En plus de la restructuration du code, 3 améliorations concrètes ont été apportées au projet : </w:t>
+        <w:t xml:space="preserve">En plus de la restructuration du code, </w:t>
+      </w:r>
+      <w:r>
+        <w:rPr>
+          <w:rFonts w:ascii="Times New Roman" w:hAnsi="Times New Roman" w:cs="Times New Roman"/>
+        </w:rPr>
+        <w:t>3</w:t>
+      </w:r>
+      <w:r>
+        <w:rPr>
+          <w:rFonts w:ascii="Times New Roman" w:hAnsi="Times New Roman" w:cs="Times New Roman"/>
+        </w:rPr>
+        <w:t xml:space="preserve"> améliorations concrètes ont été apportées au projet : </w:t>
       </w:r>
     </w:p>
     <w:p>
@@ -1734,7 +1773,6 @@
           <w:sz w:val="28"/>
           <w:szCs w:val="28"/>
         </w:rPr>
-        <w:lastRenderedPageBreak/>
         <w:t>Main.py :</w:t>
       </w:r>
       <w:r>
@@ -1832,10 +1870,10 @@
           <w:szCs w:val="28"/>
         </w:rPr>
         <w:drawing>
-          <wp:inline distT="0" distB="0" distL="0" distR="0" wp14:anchorId="3E6345EE" wp14:editId="3CEF5309">
-            <wp:extent cx="5760720" cy="4932680"/>
-            <wp:effectExtent l="0" t="0" r="5080" b="0"/>
-            <wp:docPr id="2050800607" name="Image 6" descr="Une image contenant texte, capture d’écran, logiciel&#10;&#10;Le contenu généré par l’IA peut être incorrect."/>
+          <wp:inline distT="0" distB="0" distL="0" distR="0" wp14:anchorId="4E14286F" wp14:editId="7B684933">
+            <wp:extent cx="5760720" cy="5507355"/>
+            <wp:effectExtent l="0" t="0" r="5080" b="4445"/>
+            <wp:docPr id="588262470" name="Image 14" descr="Une image contenant texte, capture d’écran&#10;&#10;Le contenu généré par l’IA peut être incorrect."/>
             <wp:cNvGraphicFramePr>
               <a:graphicFrameLocks xmlns:a="http://schemas.openxmlformats.org/drawingml/2006/main" noChangeAspect="1"/>
             </wp:cNvGraphicFramePr>
@@ -1843,7 +1881,7 @@
               <a:graphicData uri="http://schemas.openxmlformats.org/drawingml/2006/picture">
                 <pic:pic xmlns:pic="http://schemas.openxmlformats.org/drawingml/2006/picture">
                   <pic:nvPicPr>
-                    <pic:cNvPr id="2050800607" name="Image 6" descr="Une image contenant texte, capture d’écran, logiciel&#10;&#10;Le contenu généré par l’IA peut être incorrect."/>
+                    <pic:cNvPr id="588262470" name="Image 14" descr="Une image contenant texte, capture d’écran&#10;&#10;Le contenu généré par l’IA peut être incorrect."/>
                     <pic:cNvPicPr/>
                   </pic:nvPicPr>
                   <pic:blipFill>
@@ -1861,7 +1899,7 @@
                   <pic:spPr>
                     <a:xfrm>
                       <a:off x="0" y="0"/>
-                      <a:ext cx="5760720" cy="4932680"/>
+                      <a:ext cx="5760720" cy="5507355"/>
                     </a:xfrm>
                     <a:prstGeom prst="rect">
                       <a:avLst/>
@@ -1928,7 +1966,6 @@
           <w:sz w:val="28"/>
           <w:szCs w:val="28"/>
         </w:rPr>
-        <w:lastRenderedPageBreak/>
         <w:drawing>
           <wp:inline distT="0" distB="0" distL="0" distR="0" wp14:anchorId="757D8A7E" wp14:editId="7E1D1659">
             <wp:extent cx="5760720" cy="2798445"/>
@@ -2014,6 +2051,7 @@
           <w:sz w:val="28"/>
           <w:szCs w:val="28"/>
         </w:rPr>
+        <w:lastRenderedPageBreak/>
         <w:drawing>
           <wp:inline distT="0" distB="0" distL="0" distR="0" wp14:anchorId="3DECC885" wp14:editId="347EC374">
             <wp:extent cx="5760720" cy="5521325"/>
@@ -2076,30 +2114,30 @@
           <w:sz w:val="28"/>
           <w:szCs w:val="28"/>
         </w:rPr>
+        <w:t>Helpers.py :</w:t>
+      </w:r>
+    </w:p>
+    <w:p>
+      <w:pPr>
+        <w:jc w:val="both"/>
+        <w:rPr>
+          <w:rFonts w:ascii="Times New Roman" w:hAnsi="Times New Roman" w:cs="Times New Roman"/>
+          <w:b/>
+          <w:bCs/>
+          <w:sz w:val="28"/>
+          <w:szCs w:val="28"/>
+        </w:rPr>
+      </w:pPr>
+      <w:r>
+        <w:rPr>
+          <w:rFonts w:ascii="Times New Roman" w:hAnsi="Times New Roman" w:cs="Times New Roman"/>
+          <w:b/>
+          <w:bCs/>
+          <w:noProof/>
+          <w:sz w:val="28"/>
+          <w:szCs w:val="28"/>
+        </w:rPr>
         <w:lastRenderedPageBreak/>
-        <w:t>Helpers.py :</w:t>
-      </w:r>
-    </w:p>
-    <w:p>
-      <w:pPr>
-        <w:jc w:val="both"/>
-        <w:rPr>
-          <w:rFonts w:ascii="Times New Roman" w:hAnsi="Times New Roman" w:cs="Times New Roman"/>
-          <w:b/>
-          <w:bCs/>
-          <w:sz w:val="28"/>
-          <w:szCs w:val="28"/>
-        </w:rPr>
-      </w:pPr>
-      <w:r>
-        <w:rPr>
-          <w:rFonts w:ascii="Times New Roman" w:hAnsi="Times New Roman" w:cs="Times New Roman"/>
-          <w:b/>
-          <w:bCs/>
-          <w:noProof/>
-          <w:sz w:val="28"/>
-          <w:szCs w:val="28"/>
-        </w:rPr>
         <w:drawing>
           <wp:inline distT="0" distB="0" distL="0" distR="0" wp14:anchorId="6491606E" wp14:editId="0B003E3D">
             <wp:extent cx="5760720" cy="5513705"/>
@@ -2379,9 +2417,94 @@
         </w:drawing>
       </w:r>
     </w:p>
+    <w:p>
+      <w:pPr>
+        <w:jc w:val="both"/>
+        <w:rPr>
+          <w:rFonts w:ascii="Times New Roman" w:hAnsi="Times New Roman" w:cs="Times New Roman"/>
+          <w:b/>
+          <w:bCs/>
+          <w:sz w:val="28"/>
+          <w:szCs w:val="28"/>
+        </w:rPr>
+      </w:pPr>
+      <w:r>
+        <w:rPr>
+          <w:rFonts w:ascii="Times New Roman" w:hAnsi="Times New Roman" w:cs="Times New Roman"/>
+          <w:b/>
+          <w:bCs/>
+          <w:sz w:val="28"/>
+          <w:szCs w:val="28"/>
+        </w:rPr>
+        <w:t>View.py :</w:t>
+      </w:r>
+    </w:p>
+    <w:p>
+      <w:pPr>
+        <w:jc w:val="both"/>
+        <w:rPr>
+          <w:rFonts w:ascii="Times New Roman" w:hAnsi="Times New Roman" w:cs="Times New Roman"/>
+          <w:b/>
+          <w:bCs/>
+          <w:sz w:val="28"/>
+          <w:szCs w:val="28"/>
+        </w:rPr>
+      </w:pPr>
+      <w:r>
+        <w:rPr>
+          <w:rFonts w:ascii="Times New Roman" w:hAnsi="Times New Roman" w:cs="Times New Roman"/>
+          <w:b/>
+          <w:bCs/>
+          <w:noProof/>
+          <w:sz w:val="28"/>
+          <w:szCs w:val="28"/>
+        </w:rPr>
+        <w:drawing>
+          <wp:inline distT="0" distB="0" distL="0" distR="0" wp14:anchorId="121F89A4" wp14:editId="3F60B0B8">
+            <wp:extent cx="5760720" cy="3566795"/>
+            <wp:effectExtent l="0" t="0" r="5080" b="1905"/>
+            <wp:docPr id="1439000783" name="Image 15" descr="Une image contenant texte, capture d’écran, logiciel, Logiciel multimédia&#10;&#10;Le contenu généré par l’IA peut être incorrect."/>
+            <wp:cNvGraphicFramePr>
+              <a:graphicFrameLocks xmlns:a="http://schemas.openxmlformats.org/drawingml/2006/main" noChangeAspect="1"/>
+            </wp:cNvGraphicFramePr>
+            <a:graphic xmlns:a="http://schemas.openxmlformats.org/drawingml/2006/main">
+              <a:graphicData uri="http://schemas.openxmlformats.org/drawingml/2006/picture">
+                <pic:pic xmlns:pic="http://schemas.openxmlformats.org/drawingml/2006/picture">
+                  <pic:nvPicPr>
+                    <pic:cNvPr id="1439000783" name="Image 15" descr="Une image contenant texte, capture d’écran, logiciel, Logiciel multimédia&#10;&#10;Le contenu généré par l’IA peut être incorrect."/>
+                    <pic:cNvPicPr/>
+                  </pic:nvPicPr>
+                  <pic:blipFill>
+                    <a:blip r:embed="rId17" cstate="print">
+                      <a:extLst>
+                        <a:ext uri="{28A0092B-C50C-407E-A947-70E740481C1C}">
+                          <a14:useLocalDpi xmlns:a14="http://schemas.microsoft.com/office/drawing/2010/main" val="0"/>
+                        </a:ext>
+                      </a:extLst>
+                    </a:blip>
+                    <a:stretch>
+                      <a:fillRect/>
+                    </a:stretch>
+                  </pic:blipFill>
+                  <pic:spPr>
+                    <a:xfrm>
+                      <a:off x="0" y="0"/>
+                      <a:ext cx="5760720" cy="3566795"/>
+                    </a:xfrm>
+                    <a:prstGeom prst="rect">
+                      <a:avLst/>
+                    </a:prstGeom>
+                  </pic:spPr>
+                </pic:pic>
+              </a:graphicData>
+            </a:graphic>
+          </wp:inline>
+        </w:drawing>
+      </w:r>
+    </w:p>
     <w:sectPr>
-      <w:footerReference w:type="even" r:id="rId17"/>
-      <w:footerReference w:type="default" r:id="rId18"/>
+      <w:footerReference w:type="even" r:id="rId18"/>
+      <w:footerReference w:type="default" r:id="rId19"/>
       <w:pgSz w:w="11906" w:h="16838"/>
       <w:pgMar w:top="1417" w:right="1417" w:bottom="1417" w:left="1417" w:header="708" w:footer="708" w:gutter="0"/>
       <w:cols w:space="708"/>

</xml_diff>